<commit_message>
Update IEEE formatted paper with latest revisions
</commit_message>
<xml_diff>
--- a/papers/DAFB_CLS_IEEE_Formatted.docx
+++ b/papers/DAFB_CLS_IEEE_Formatted.docx
@@ -77,10 +77,10 @@
           <w:lang w:val="en-US"/>
         </w:rPr>
       </w:pPr>
-      <w:bookmarkStart w:id="0" w:name="_heading=h.gjdgxs" w:colFirst="0" w:colLast="0"/>
-      <w:bookmarkEnd w:id="0"/>
       <m:oMath>
         <m:sSup>
+          <w:bookmarkStart w:id="0" w:name="_heading=h.gjdgxs" w:colFirst="0" w:colLast="0"/>
+          <w:bookmarkEnd w:id="0"/>
           <m:sSupPr>
             <m:ctrlPr>
               <w:rPr>
@@ -7477,12 +7477,6 @@
             <w:insideH w:val="single" w:color="auto" w:sz="4" w:space="0"/>
             <w:insideV w:val="single" w:color="auto" w:sz="4" w:space="0"/>
           </w:tblBorders>
-          <w:tblCellMar>
-            <w:top w:w="0" w:type="dxa"/>
-            <w:left w:w="108" w:type="dxa"/>
-            <w:bottom w:w="0" w:type="dxa"/>
-            <w:right w:w="108" w:type="dxa"/>
-          </w:tblCellMar>
         </w:tblPrEx>
         <w:trPr>
           <w:trHeight w:val="0" w:hRule="atLeast"/>
@@ -11104,15 +11098,7 @@
         <w:rPr>
           <w:rFonts w:hint="eastAsia"/>
         </w:rPr>
-        <w:t>Stable background is the Achilles' heel. As discussed in Section IV-D and visualized in Fig. 3, images dominated by smooth, low-texture regions show the most severe degradation. Table VI quantifies this: FG IoU drops to 13.02% and PiB falls to 20.87%. The root cause is architectural — the frequency stability cue, designed to identify stable foreground patches via FFT low-pass fi</w:t>
-      </w:r>
-      <w:bookmarkStart w:id="4" w:name="_GoBack"/>
-      <w:bookmarkEnd w:id="4"/>
-      <w:r>
-        <w:rPr>
-          <w:rFonts w:hint="eastAsia"/>
-        </w:rPr>
-        <w:t>ltering, cannot distinguish a smooth foreground object from a smooth background region, as both produce similar low-frequency activation patterns. The model consequently over-predicts foreground in these scenes (predicted ratio 0.48 vs. ground truth typically &lt; 0.20). Mitigating this failure mode requires either an explicit high-frequency rejection cue or a learned background-prior head — directions we leave for future work.</w:t>
+        <w:t>Stable background is the Achilles' heel. As discussed in Section IV-D and visualized in Fig. 3, images dominated by smooth, low-texture regions show the most severe degradation. Table VI quantifies this: FG IoU drops to 13.02% and PiB falls to 20.87%. The root cause is architectural — the frequency stability cue, designed to identify stable foreground patches via FFT low-pass filtering, cannot distinguish a smooth foreground object from a smooth background region, as both produce similar low-frequency activation patterns. The model consequently over-predicts foreground in these scenes (predicted ratio 0.48 vs. ground truth typically &lt; 0.20). Mitigating this failure mode requires either an explicit high-frequency rejection cue or a learned background-prior head — directions we leave for future work.</w:t>
       </w:r>
     </w:p>
     <w:p>
@@ -13407,46 +13393,33 @@
     </w:p>
     <w:p>
       <w:pPr>
-        <w:pStyle w:val="14"/>
-        <w:spacing w:after="80" w:line="276" w:lineRule="auto"/>
-      </w:pPr>
-      <w:r>
-        <w:rPr>
-          <w:rFonts w:ascii="Times New Roman" w:hAnsi="Times New Roman"/>
-          <w:sz w:val="20"/>
-        </w:rPr>
+        <w:pStyle w:val="38"/>
+        <w:bidi w:val="0"/>
+      </w:pPr>
+      <w:r>
         <w:t>This paper addressed Lazy Aggregation in Vision Transformers, where the [CLS] token systematically biases toward background patches. We proposed DAFB-CLS, a lightweight post-hoc framework that decouples the [CLS] token into independent foreground and background streams with depth-adaptive aggregation, and enriches the foreground signal through multi-cue scoring with image-adaptive soft masking.</w:t>
       </w:r>
     </w:p>
     <w:p>
       <w:pPr>
-        <w:pStyle w:val="14"/>
-        <w:spacing w:after="80" w:line="276" w:lineRule="auto"/>
-        <w:rPr>
-          <w:rFonts w:ascii="Times New Roman" w:hAnsi="Times New Roman"/>
-          <w:sz w:val="20"/>
-        </w:rPr>
-      </w:pPr>
-      <w:r>
-        <w:rPr>
-          <w:rFonts w:ascii="Times New Roman" w:hAnsi="Times New Roman"/>
-          <w:sz w:val="20"/>
-        </w:rPr>
-        <w:t>The key insight is that foreground-background separation must occur at the aggregation level — accounting for both spatial selection (which patches are foreground) and depth selection (which layers best represent each stream). By fusing four complementary cues, learning per-image thresholds, and maintaining independent depth attention, DAFB-CLS achieves +13.7 pp CorLoc and +18.0 pp Mask IoU over the strongest aggregation baseline, with robust cross-dataset generalization. The ablation reveals a clear division of labor among components, while stress tests identify stable backgrounds as the primary remaining challenge. This architectural limitation points toward explicit high-frequency rejection and learned background priors as promising future directions.</w:t>
-      </w:r>
-    </w:p>
-    <w:p>
-      <w:pPr>
-        <w:rPr>
-          <w:rFonts w:ascii="Times New Roman" w:hAnsi="Times New Roman"/>
-          <w:sz w:val="20"/>
-        </w:rPr>
-      </w:pPr>
-      <w:r>
-        <w:rPr>
-          <w:rFonts w:ascii="Times New Roman" w:hAnsi="Times New Roman"/>
-          <w:sz w:val="20"/>
-        </w:rPr>
+        <w:pStyle w:val="38"/>
+        <w:bidi w:val="0"/>
+      </w:pPr>
+      <w:r>
+        <w:t>The key insight is that foreground-background separation must occur at the aggregation level — accounting for both spatial selection (which patches are foreground) and depth selection (which layers best represent each stream). By fusing four complementary cues, learning per-image thresholds, and maintaini</w:t>
+      </w:r>
+      <w:bookmarkStart w:id="4" w:name="_GoBack"/>
+      <w:bookmarkEnd w:id="4"/>
+      <w:r>
+        <w:t>ng independent depth attention, DAFB-CLS achieves +13.7 pp CorLoc and +18.0 pp Mask IoU over the strongest aggregation baseline, with robust cross-dataset generalization. The ablation reveals a clear division of labor among components, while stress tests identify stable backgrounds as the primary remaining challenge. This architectural limitation points toward explicit high-frequency rejection and learned background priors as promising future directions.</w:t>
+      </w:r>
+    </w:p>
+    <w:p>
+      <w:pPr>
+        <w:pStyle w:val="38"/>
+        <w:bidi w:val="0"/>
+      </w:pPr>
+      <w:r>
         <w:t>Vision Transformers exhibit Lazy Aggregation: their [CLS] token shortcuts background patches under image-level supervision, diluting the foreground signal required for dense prediction tasks. We showed that this bias can be corrected at the aggregation level by jointly addressing its spatial and depth dimensions. DAFB-CLS decouples the [CLS] token into independent foreground and background streams, enriches the foreground signal with four complementary cues and an image-adaptive soft mask, and learns stream-specific depth attention across multi-layer features. The framework adds only 0.59M trainable parameters and operates on frozen backbone features, requiring no text supervision.</w:t>
       </w:r>
     </w:p>
@@ -15571,23 +15544,23 @@
 </file>
 
 <file path=customXml/item1.xml><?xml version="1.0" encoding="utf-8"?>
-<b:Sources xmlns:b="http://schemas.openxmlformats.org/officeDocument/2006/bibliography" xmlns="http://schemas.openxmlformats.org/officeDocument/2006/bibliography" SelectedStyle="\APASixthEditionOfficeOnline.xsl" StyleName="APA" Version="6"/>
-</file>
-
-<file path=customXml/item2.xml><?xml version="1.0" encoding="utf-8"?>
 <go:gDocsCustomXmlDataStorage xmlns:go="http://customooxmlschemas.google.com/" xmlns:r="http://schemas.openxmlformats.org/officeDocument/2006/relationships">
   <go:docsCustomData xmlns:go="http://customooxmlschemas.google.com/" roundtripDataSignature="AMtx7mjPovk3igAzhESNbNe8yh+DWI7/jA==">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</go:docsCustomData>
 </go:gDocsCustomXmlDataStorage>
 </file>
 
+<file path=customXml/item2.xml><?xml version="1.0" encoding="utf-8"?>
+<b:Sources xmlns:b="http://schemas.openxmlformats.org/officeDocument/2006/bibliography" xmlns="http://schemas.openxmlformats.org/officeDocument/2006/bibliography" SelectedStyle="\APASixthEditionOfficeOnline.xsl" StyleName="APA" Version="6"/>
+</file>
+
 <file path=customXml/itemProps1.xml><?xml version="1.0" encoding="utf-8"?>
-<ds:datastoreItem xmlns:ds="http://schemas.openxmlformats.org/officeDocument/2006/customXml" ds:itemID="{7FDB3116-7FC6-4074-8BFD-613BFCEE0C0E}">
+<ds:datastoreItem xmlns:ds="http://schemas.openxmlformats.org/officeDocument/2006/customXml" ds:itemID="{11111111-1234-1234-1234-123412341234}">
   <ds:schemaRefs/>
 </ds:datastoreItem>
 </file>
 
 <file path=customXml/itemProps2.xml><?xml version="1.0" encoding="utf-8"?>
-<ds:datastoreItem xmlns:ds="http://schemas.openxmlformats.org/officeDocument/2006/customXml" ds:itemID="{11111111-1234-1234-1234-123412341234}">
+<ds:datastoreItem xmlns:ds="http://schemas.openxmlformats.org/officeDocument/2006/customXml" ds:itemID="{7FDB3116-7FC6-4074-8BFD-613BFCEE0C0E}">
   <ds:schemaRefs/>
 </ds:datastoreItem>
 </file>
</xml_diff>